<commit_message>
feat(submit): align user guide with experimental deliverables and synchronize packaging script
</commit_message>
<xml_diff>
--- a/draft/fraud-detection/docs/Huong_dan_su_dung.docx
+++ b/draft/fraud-detection/docs/Huong_dan_su_dung.docx
@@ -415,11 +415,7 @@
           </w:tcPr>
           <w:p>
             <w:r>
-              <w:rPr>
-                <w:rFonts w:ascii="Times New Roman" w:hAnsi="Times New Roman"/>
-                <w:sz w:val="21"/>
-              </w:rPr>
-              <w:t>Giao diện Web trực quan Streamlit UI, hỗ trợ kiểm tra thời gian thực, giao diện Sáng/Tối, định dạng VNĐ và Risk Meter.</w:t>
+              <w:t>Giao diện Web trực quan Streamlit UI và bộ 102 tests tự động được quản lý đầy đủ tại GitHub Repository chính thức.</w:t>
             </w:r>
           </w:p>
         </w:tc>
@@ -435,29 +431,25 @@
     </w:p>
     <w:p>
       <w:r>
-        <w:t>3.1. Khởi chạy Giao diện Demo Streamlit (Khuyến nghị):</w:t>
+        <w:t>3.1. Chạy 6 Notebooks Thực nghiệm Jupyter (Phương thức thẩm định chính):</w:t>
         <w:br/>
-        <w:t>Từ thư mục mã nguồn chạy lệnh:</w:t>
-        <w:br/>
-        <w:t xml:space="preserve">  streamlit run demo/app.py</w:t>
-        <w:br/>
-        <w:t>Trình duyệt sẽ tự động mở tại http://localhost:8501 để tương tác trực tiếp.</w:t>
+        <w:t>Mở Jupyter Lab / Notebooks và chạy lần lượt từ 01_eda.ipynb đến 06_evaluation_comparison.ipynb trong thư mục code/notebooks/. Tất cả 6 notebooks đều đã được chạy sạch (Clean Run) và lưu sẵn đầy đủ kết quả, biểu đồ trực quan.</w:t>
       </w:r>
     </w:p>
     <w:p>
       <w:r>
-        <w:t>3.2. Chạy 6 Notebooks Thực nghiệm Jupyter:</w:t>
+        <w:t>3.2. Xem Minh chứng Video Clip Thuyết minh Demo Giao diện:</w:t>
         <w:br/>
-        <w:t>Mở Jupyter Lab / Notebooks và chạy lần lượt từ 01_eda.ipynb đến 06_evaluation_comparison.ipynb. Tất cả đều đã được lưu sẵn kết quả biểu đồ.</w:t>
+        <w:t>Quý Thầy/Cô có thể xem video clip thuyết minh giao diện tương tác Streamlit Web UI (Full HD 1080p, thời lượng 05 phút 34 giây do sinh viên Phạm Thành Trung trình bày) qua liên kết Google Drive công khai tại file demo/LINK_VIDEO_DEMO.txt, hoặc xem trực tiếp slide 15 trong Bao_cao/[Nhom9]_Slide_FraudDetection_Academic_VN.pptx.</w:t>
       </w:r>
     </w:p>
     <w:p>
       <w:r>
-        <w:t>3.3. Chạy Kiểm thử Tự động (Tests):</w:t>
+        <w:t>3.3. Trải nghiệm Demo Trực tiếp &amp; Chạy Unit Tests trên GitHub Repository:</w:t>
         <w:br/>
-        <w:t xml:space="preserve">  pytest tests/</w:t>
+        <w:t>Để trải nghiệm ứng dụng Web thời gian thực hoặc chạy toàn bộ 102 bài test tự động (pytest tests/), kính mời Quý Thầy/Cô truy cập GitHub Repository chính thức của nhóm tại:</w:t>
         <w:br/>
-        <w:t>Hệ thống đạt 100% tỷ lệ pass (116 tests pass).</w:t>
+        <w:t>https://github.com/uit-25730067-chithanh/CS106-Team09-Fraud-Detection</w:t>
       </w:r>
     </w:p>
     <w:p>
@@ -635,14 +627,7 @@
             <w:tcW w:type="dxa" w:w="1560"/>
           </w:tcPr>
           <w:p>
-            <w:pPr>
-              <w:jc w:val="center"/>
-            </w:pPr>
             <w:r>
-              <w:rPr>
-                <w:rFonts w:ascii="Times New Roman" w:hAnsi="Times New Roman"/>
-                <w:sz w:val="21"/>
-              </w:rPr>
               <w:t>0.9973</w:t>
             </w:r>
           </w:p>
@@ -652,14 +637,7 @@
             <w:tcW w:type="dxa" w:w="1560"/>
           </w:tcPr>
           <w:p>
-            <w:pPr>
-              <w:jc w:val="center"/>
-            </w:pPr>
             <w:r>
-              <w:rPr>
-                <w:rFonts w:ascii="Times New Roman" w:hAnsi="Times New Roman"/>
-                <w:sz w:val="21"/>
-              </w:rPr>
               <w:t>0.9994</w:t>
             </w:r>
           </w:p>
@@ -669,15 +647,8 @@
             <w:tcW w:type="dxa" w:w="1560"/>
           </w:tcPr>
           <w:p>
-            <w:pPr>
-              <w:jc w:val="center"/>
-            </w:pPr>
             <w:r>
-              <w:rPr>
-                <w:rFonts w:ascii="Times New Roman" w:hAnsi="Times New Roman"/>
-                <w:sz w:val="21"/>
-              </w:rPr>
-              <w:t>0.9981</w:t>
+              <w:t>0.9983</w:t>
             </w:r>
           </w:p>
         </w:tc>
@@ -686,15 +657,8 @@
             <w:tcW w:type="dxa" w:w="1560"/>
           </w:tcPr>
           <w:p>
-            <w:pPr>
-              <w:jc w:val="center"/>
-            </w:pPr>
             <w:r>
-              <w:rPr>
-                <w:rFonts w:ascii="Times New Roman" w:hAnsi="Times New Roman"/>
-                <w:sz w:val="21"/>
-              </w:rPr>
-              <w:t>~180s</w:t>
+              <w:t>1187s</w:t>
             </w:r>
           </w:p>
         </w:tc>
@@ -736,14 +700,7 @@
             <w:tcW w:type="dxa" w:w="1560"/>
           </w:tcPr>
           <w:p>
-            <w:pPr>
-              <w:jc w:val="center"/>
-            </w:pPr>
             <w:r>
-              <w:rPr>
-                <w:rFonts w:ascii="Times New Roman" w:hAnsi="Times New Roman"/>
-                <w:sz w:val="21"/>
-              </w:rPr>
               <w:t>0.9966</w:t>
             </w:r>
           </w:p>
@@ -753,14 +710,7 @@
             <w:tcW w:type="dxa" w:w="1560"/>
           </w:tcPr>
           <w:p>
-            <w:pPr>
-              <w:jc w:val="center"/>
-            </w:pPr>
             <w:r>
-              <w:rPr>
-                <w:rFonts w:ascii="Times New Roman" w:hAnsi="Times New Roman"/>
-                <w:sz w:val="21"/>
-              </w:rPr>
               <w:t>0.9992</w:t>
             </w:r>
           </w:p>
@@ -770,15 +720,8 @@
             <w:tcW w:type="dxa" w:w="1560"/>
           </w:tcPr>
           <w:p>
-            <w:pPr>
-              <w:jc w:val="center"/>
-            </w:pPr>
             <w:r>
-              <w:rPr>
-                <w:rFonts w:ascii="Times New Roman" w:hAnsi="Times New Roman"/>
-                <w:sz w:val="21"/>
-              </w:rPr>
-              <w:t>0.9974</w:t>
+              <w:t>0.9978</w:t>
             </w:r>
           </w:p>
         </w:tc>
@@ -787,15 +730,8 @@
             <w:tcW w:type="dxa" w:w="1560"/>
           </w:tcPr>
           <w:p>
-            <w:pPr>
-              <w:jc w:val="center"/>
-            </w:pPr>
             <w:r>
-              <w:rPr>
-                <w:rFonts w:ascii="Times New Roman" w:hAnsi="Times New Roman"/>
-                <w:sz w:val="21"/>
-              </w:rPr>
-              <w:t>~195s</w:t>
+              <w:t>1168s</w:t>
             </w:r>
           </w:p>
         </w:tc>
@@ -837,14 +773,7 @@
             <w:tcW w:type="dxa" w:w="1560"/>
           </w:tcPr>
           <w:p>
-            <w:pPr>
-              <w:jc w:val="center"/>
-            </w:pPr>
             <w:r>
-              <w:rPr>
-                <w:rFonts w:ascii="Times New Roman" w:hAnsi="Times New Roman"/>
-                <w:sz w:val="21"/>
-              </w:rPr>
               <w:t>0.9963</w:t>
             </w:r>
           </w:p>
@@ -854,14 +783,7 @@
             <w:tcW w:type="dxa" w:w="1560"/>
           </w:tcPr>
           <w:p>
-            <w:pPr>
-              <w:jc w:val="center"/>
-            </w:pPr>
             <w:r>
-              <w:rPr>
-                <w:rFonts w:ascii="Times New Roman" w:hAnsi="Times New Roman"/>
-                <w:sz w:val="21"/>
-              </w:rPr>
               <w:t>0.9993</w:t>
             </w:r>
           </w:p>
@@ -871,15 +793,8 @@
             <w:tcW w:type="dxa" w:w="1560"/>
           </w:tcPr>
           <w:p>
-            <w:pPr>
-              <w:jc w:val="center"/>
-            </w:pPr>
             <w:r>
-              <w:rPr>
-                <w:rFonts w:ascii="Times New Roman" w:hAnsi="Times New Roman"/>
-                <w:sz w:val="21"/>
-              </w:rPr>
-              <w:t>0.9978</w:t>
+              <w:t>0.9969</w:t>
             </w:r>
           </w:p>
         </w:tc>
@@ -888,15 +803,8 @@
             <w:tcW w:type="dxa" w:w="1560"/>
           </w:tcPr>
           <w:p>
-            <w:pPr>
-              <w:jc w:val="center"/>
-            </w:pPr>
             <w:r>
-              <w:rPr>
-                <w:rFonts w:ascii="Times New Roman" w:hAnsi="Times New Roman"/>
-                <w:sz w:val="21"/>
-              </w:rPr>
-              <w:t>41.6s</w:t>
+              <w:t>57.94s</w:t>
             </w:r>
           </w:p>
         </w:tc>
@@ -938,14 +846,7 @@
             <w:tcW w:type="dxa" w:w="1560"/>
           </w:tcPr>
           <w:p>
-            <w:pPr>
-              <w:jc w:val="center"/>
-            </w:pPr>
             <w:r>
-              <w:rPr>
-                <w:rFonts w:ascii="Times New Roman" w:hAnsi="Times New Roman"/>
-                <w:sz w:val="21"/>
-              </w:rPr>
               <w:t>0.9954</w:t>
             </w:r>
           </w:p>
@@ -955,14 +856,7 @@
             <w:tcW w:type="dxa" w:w="1560"/>
           </w:tcPr>
           <w:p>
-            <w:pPr>
-              <w:jc w:val="center"/>
-            </w:pPr>
             <w:r>
-              <w:rPr>
-                <w:rFonts w:ascii="Times New Roman" w:hAnsi="Times New Roman"/>
-                <w:sz w:val="21"/>
-              </w:rPr>
               <w:t>0.9994</w:t>
             </w:r>
           </w:p>
@@ -972,15 +866,8 @@
             <w:tcW w:type="dxa" w:w="1560"/>
           </w:tcPr>
           <w:p>
-            <w:pPr>
-              <w:jc w:val="center"/>
-            </w:pPr>
             <w:r>
-              <w:rPr>
-                <w:rFonts w:ascii="Times New Roman" w:hAnsi="Times New Roman"/>
-                <w:sz w:val="21"/>
-              </w:rPr>
-              <w:t>0.9975</w:t>
+              <w:t>0.9976</w:t>
             </w:r>
           </w:p>
         </w:tc>
@@ -989,15 +876,8 @@
             <w:tcW w:type="dxa" w:w="1560"/>
           </w:tcPr>
           <w:p>
-            <w:pPr>
-              <w:jc w:val="center"/>
-            </w:pPr>
             <w:r>
-              <w:rPr>
-                <w:rFonts w:ascii="Times New Roman" w:hAnsi="Times New Roman"/>
-                <w:sz w:val="21"/>
-              </w:rPr>
-              <w:t>45.2s</w:t>
+              <w:t>45.48s</w:t>
             </w:r>
           </w:p>
         </w:tc>
@@ -1039,15 +919,8 @@
             <w:tcW w:type="dxa" w:w="1560"/>
           </w:tcPr>
           <w:p>
-            <w:pPr>
-              <w:jc w:val="center"/>
-            </w:pPr>
             <w:r>
-              <w:rPr>
-                <w:rFonts w:ascii="Times New Roman" w:hAnsi="Times New Roman"/>
-                <w:sz w:val="21"/>
-              </w:rPr>
-              <w:t>0.5074</w:t>
+              <w:t>0.5069</w:t>
             </w:r>
           </w:p>
         </w:tc>
@@ -1056,14 +929,7 @@
             <w:tcW w:type="dxa" w:w="1560"/>
           </w:tcPr>
           <w:p>
-            <w:pPr>
-              <w:jc w:val="center"/>
-            </w:pPr>
             <w:r>
-              <w:rPr>
-                <w:rFonts w:ascii="Times New Roman" w:hAnsi="Times New Roman"/>
-                <w:sz w:val="21"/>
-              </w:rPr>
               <w:t>0.9318</w:t>
             </w:r>
           </w:p>
@@ -1073,15 +939,8 @@
             <w:tcW w:type="dxa" w:w="1560"/>
           </w:tcPr>
           <w:p>
-            <w:pPr>
-              <w:jc w:val="center"/>
-            </w:pPr>
             <w:r>
-              <w:rPr>
-                <w:rFonts w:ascii="Times New Roman" w:hAnsi="Times New Roman"/>
-                <w:sz w:val="21"/>
-              </w:rPr>
-              <w:t>0.4421</w:t>
+              <w:t>0.5973</w:t>
             </w:r>
           </w:p>
         </w:tc>
@@ -1090,14 +949,7 @@
             <w:tcW w:type="dxa" w:w="1560"/>
           </w:tcPr>
           <w:p>
-            <w:pPr>
-              <w:jc w:val="center"/>
-            </w:pPr>
             <w:r>
-              <w:rPr>
-                <w:rFonts w:ascii="Times New Roman" w:hAnsi="Times New Roman"/>
-                <w:sz w:val="21"/>
-              </w:rPr>
               <w:t>~90s</w:t>
             </w:r>
           </w:p>

</xml_diff>